<commit_message>
fix(admin): cai thien tao/sua tai khoan va bo sung modal sua vai tro nguoi dung
</commit_message>
<xml_diff>
--- a/docs/bao_cao/Bao_Cao_Thực Tập.docx
+++ b/docs/bao_cao/Bao_Cao_Thực Tập.docx
@@ -7971,28 +7971,120 @@
       </w:r>
     </w:p>
     <w:p>
-      <w:r>
+      <w:pPr>
+        <w:spacing w:before="0" w:after="60" w:line="276" w:lineRule="auto"/>
+        <w:jc w:val="left"/>
+      </w:pPr>
+      <w:r/>
+      <w:r>
+        <w:rPr>
+          <w:rFonts w:ascii="Times New Roman" w:hAnsi="Times New Roman"/>
+          <w:rFonts w:ascii="Times New Roman" w:hAnsi="Times New Roman" w:cs="Times New Roman"/>
+          <w:b w:val="0"/>
+          <w:i w:val="0"/>
+          <w:sz w:val="26"/>
+        </w:rPr>
         <w:t>Hình 1.1. Hình ảnh đơn vị thực tập</w:t>
       </w:r>
     </w:p>
     <w:p>
-      <w:r>
+      <w:pPr>
+        <w:spacing w:before="0" w:after="60" w:line="276" w:lineRule="auto"/>
+        <w:jc w:val="left"/>
+      </w:pPr>
+      <w:r/>
+      <w:r>
+        <w:rPr>
+          <w:rFonts w:ascii="Times New Roman" w:hAnsi="Times New Roman"/>
+          <w:rFonts w:ascii="Times New Roman" w:hAnsi="Times New Roman" w:cs="Times New Roman"/>
+          <w:b w:val="0"/>
+          <w:i w:val="0"/>
+          <w:sz w:val="26"/>
+        </w:rPr>
         <w:t>Hình 2.1. Kiến trúc tổng thể hệ thống LearnPython</w:t>
       </w:r>
     </w:p>
     <w:p>
-      <w:r>
-        <w:t>Hình 2.2. Màn hình thực hành lập trình trực tuyến</w:t>
-      </w:r>
-    </w:p>
-    <w:p>
-      <w:r>
-        <w:t>Hình 2.3. Đường cong ROC của benchmark Knowledge Tracing</w:t>
-      </w:r>
-    </w:p>
-    <w:p>
-      <w:r>
-        <w:t>Hình 2.4. Biểu đồ hiệu chuẩn xác suất của các mô hình</w:t>
+      <w:pPr>
+        <w:spacing w:before="0" w:after="60" w:line="276" w:lineRule="auto"/>
+        <w:jc w:val="left"/>
+      </w:pPr>
+      <w:r/>
+      <w:r>
+        <w:rPr>
+          <w:rFonts w:ascii="Times New Roman" w:hAnsi="Times New Roman"/>
+          <w:rFonts w:ascii="Times New Roman" w:hAnsi="Times New Roman" w:cs="Times New Roman"/>
+          <w:b w:val="0"/>
+          <w:i w:val="0"/>
+          <w:sz w:val="26"/>
+        </w:rPr>
+        <w:t>Hình 2.2. Sơ đồ Use Case tổng thể toàn hệ thống LearnPython</w:t>
+      </w:r>
+    </w:p>
+    <w:p>
+      <w:pPr>
+        <w:spacing w:before="0" w:after="60" w:line="276" w:lineRule="auto"/>
+        <w:jc w:val="left"/>
+      </w:pPr>
+      <w:r/>
+      <w:r>
+        <w:rPr>
+          <w:rFonts w:ascii="Times New Roman" w:hAnsi="Times New Roman"/>
+          <w:rFonts w:ascii="Times New Roman" w:hAnsi="Times New Roman" w:cs="Times New Roman"/>
+          <w:b w:val="0"/>
+          <w:i w:val="0"/>
+          <w:sz w:val="26"/>
+        </w:rPr>
+        <w:t>Hình 2.3. Màn hình thực hành lập trình trực tuyến</w:t>
+      </w:r>
+    </w:p>
+    <w:p>
+      <w:pPr>
+        <w:spacing w:before="0" w:after="60" w:line="276" w:lineRule="auto"/>
+        <w:jc w:val="left"/>
+      </w:pPr>
+      <w:r/>
+      <w:r>
+        <w:rPr>
+          <w:rFonts w:ascii="Times New Roman" w:hAnsi="Times New Roman"/>
+          <w:rFonts w:ascii="Times New Roman" w:hAnsi="Times New Roman" w:cs="Times New Roman"/>
+          <w:b w:val="0"/>
+          <w:i w:val="0"/>
+          <w:sz w:val="26"/>
+        </w:rPr>
+        <w:t>Hình 2.4. Màn hình lộ trình cá nhân hóa hoặc đề xuất bài học tiếp theo</w:t>
+      </w:r>
+    </w:p>
+    <w:p>
+      <w:pPr>
+        <w:spacing w:before="0" w:after="60" w:line="276" w:lineRule="auto"/>
+        <w:jc w:val="left"/>
+      </w:pPr>
+      <w:r>
+        <w:rPr>
+          <w:rFonts w:ascii="Times New Roman" w:hAnsi="Times New Roman"/>
+          <w:rFonts w:ascii="Times New Roman" w:hAnsi="Times New Roman" w:cs="Times New Roman"/>
+          <w:b w:val="0"/>
+          <w:i w:val="0"/>
+          <w:sz w:val="26"/>
+        </w:rPr>
+        <w:t>Hình 3.1. Đường cong ROC trên tập kiểm tra cuối của benchmark ASSISTments</w:t>
+      </w:r>
+    </w:p>
+    <w:p>
+      <w:pPr>
+        <w:spacing w:before="0" w:after="60" w:line="276" w:lineRule="auto"/>
+        <w:jc w:val="left"/>
+      </w:pPr>
+      <w:r>
+        <w:rPr>
+          <w:rFonts w:ascii="Times New Roman" w:hAnsi="Times New Roman"/>
+          <w:rFonts w:ascii="Times New Roman" w:hAnsi="Times New Roman" w:cs="Times New Roman"/>
+          <w:b w:val="0"/>
+          <w:i w:val="0"/>
+          <w:sz w:val="26"/>
+        </w:rPr>
+        <w:t>Hình 3.2. Biểu đồ hiệu chuẩn xác suất với 10 bin đồng số lượng trên benchmark ASSISTments</w:t>
       </w:r>
     </w:p>
     <w:p>
@@ -9251,13 +9343,188 @@
     </w:p>
     <w:p>
       <w:pPr>
-        <w:spacing w:before="80"/>
-      </w:pPr>
-      <w:r>
-        <w:rPr>
+        <w:spacing w:before="120" w:after="120" w:line="276" w:lineRule="auto"/>
+        <w:jc w:val="both"/>
+      </w:pPr>
+      <w:r>
+        <w:rPr>
+          <w:rFonts w:ascii="Times New Roman" w:hAnsi="Times New Roman"/>
+          <w:rFonts w:ascii="Times New Roman" w:hAnsi="Times New Roman" w:cs="Times New Roman"/>
+          <w:b w:val="0"/>
+          <w:i w:val="0"/>
+          <w:sz w:val="26"/>
+        </w:rPr>
+        <w:t>Nhằm làm rõ mô hình tương tác chức năng và xác định ranh giới hệ thống theo chuẩn phân tích thiết kế phần mềm, Sơ đồ Use Case tổng thể toàn hệ thống LearnPython (VIBECODE AI) được xây dựng như thể hiện tại Hình 2.2.</w:t>
+      </w:r>
+    </w:p>
+    <w:p>
+      <w:pPr>
+        <w:spacing w:before="120" w:after="80" w:line="276" w:lineRule="auto"/>
+        <w:jc w:val="center"/>
+      </w:pPr>
+      <w:r>
+        <w:drawing>
+          <wp:inline xmlns:a="http://schemas.openxmlformats.org/drawingml/2006/main" xmlns:pic="http://schemas.openxmlformats.org/drawingml/2006/picture">
+            <wp:extent cx="5486400" cy="4350164"/>
+            <wp:docPr id="10" name="Picture 10"/>
+            <wp:cNvGraphicFramePr>
+              <a:graphicFrameLocks noChangeAspect="1"/>
+            </wp:cNvGraphicFramePr>
+            <a:graphic>
+              <a:graphicData uri="http://schemas.openxmlformats.org/drawingml/2006/picture">
+                <pic:pic>
+                  <pic:nvPicPr>
+                    <pic:cNvPr id="0" name="so_do_usecase_tong_the.png"/>
+                    <pic:cNvPicPr/>
+                  </pic:nvPicPr>
+                  <pic:blipFill>
+                    <a:blip r:embed="rId15"/>
+                    <a:stretch>
+                      <a:fillRect/>
+                    </a:stretch>
+                  </pic:blipFill>
+                  <pic:spPr>
+                    <a:xfrm>
+                      <a:off x="0" y="0"/>
+                      <a:ext cx="5486400" cy="4350164"/>
+                    </a:xfrm>
+                    <a:prstGeom prst="rect"/>
+                  </pic:spPr>
+                </pic:pic>
+              </a:graphicData>
+            </a:graphic>
+          </wp:inline>
+        </w:drawing>
+      </w:r>
+    </w:p>
+    <w:p>
+      <w:pPr>
+        <w:spacing w:before="0" w:after="160" w:line="276" w:lineRule="auto"/>
+        <w:jc w:val="center"/>
+      </w:pPr>
+      <w:r>
+        <w:rPr>
+          <w:rFonts w:ascii="Times New Roman" w:hAnsi="Times New Roman"/>
+          <w:rFonts w:ascii="Times New Roman" w:hAnsi="Times New Roman" w:cs="Times New Roman"/>
           <w:b/>
-        </w:rPr>
-        <w:t>[ Cung cấp ảnh ] Hình 2.2. Màn hình thực hành lập trình gồm đề bài, Monaco Editor và khu vực kết quả chạy mã.</w:t>
+          <w:i w:val="0"/>
+          <w:sz w:val="24"/>
+        </w:rPr>
+        <w:t>Hình 2.2. Sơ đồ Use Case tổng thể toàn hệ thống LearnPython</w:t>
+      </w:r>
+    </w:p>
+    <w:p>
+      <w:pPr>
+        <w:spacing w:before="80" w:after="120" w:line="276" w:lineRule="auto"/>
+        <w:jc w:val="both"/>
+      </w:pPr>
+      <w:r>
+        <w:rPr>
+          <w:rFonts w:ascii="Times New Roman" w:hAnsi="Times New Roman"/>
+          <w:rFonts w:ascii="Times New Roman" w:hAnsi="Times New Roman" w:cs="Times New Roman"/>
+          <w:b/>
+          <w:i w:val="0"/>
+          <w:sz w:val="26"/>
+        </w:rPr>
+        <w:t xml:space="preserve">1. Các tác nhân (Actors) tham gia hệ thống: </w:t>
+      </w:r>
+      <w:r>
+        <w:rPr>
+          <w:rFonts w:ascii="Times New Roman" w:hAnsi="Times New Roman"/>
+          <w:rFonts w:ascii="Times New Roman" w:hAnsi="Times New Roman" w:cs="Times New Roman"/>
+          <w:b w:val="0"/>
+          <w:i w:val="0"/>
+          <w:sz w:val="26"/>
+        </w:rPr>
+        <w:t>Mô hình phân định rõ năm tác nhân tương tác trong môi trường đào tạo lập trình thích ứng, bao gồm ba tác nhân con người và hai tác nhân dịch vụ tự động hóa:</w:t>
+        <w:br/>
+        <w:t>• Học viên (Student): Tác nhân người dùng cốt lõi, tham gia tiếp cận bài giảng, thực hành lập trình trên giao diện trực tuyến Monaco Editor, nộp bài kiểm thử tự động, tra cứu lộ trình học thích ứng và tương tác với Trợ lý AI khi gặp lỗi cú pháp hoặc thuật toán.</w:t>
+        <w:br/>
+        <w:t>• Giảng viên / Người hướng dẫn (Teacher / Mentor): Tác nhân phụ trách chuyên môn, thực hiện thiết kế bài tập, cấu hình bộ kiểm thử testcase (Input/Expected Output), theo dõi tổng quan tiến độ của người học và giải đáp nâng cao.</w:t>
+        <w:br/>
+        <w:t>• Quản trị viên (Administrator): Tác nhân có đặc quyền quản trị cao nhất, thực hiện quản lý danh sách người dùng, cấp phát quyền hạn (RBAC), kiểm soát tài nguyên hệ thống, giám sát hiệu năng vận hành và bảo đảm an toàn dữ liệu.</w:t>
+        <w:br/>
+        <w:t>• Hệ thống AI Thích ứng (AI Adaptive Service - System Actor): Tác nhân dịch vụ độc lập tiếp nhận chuỗi telemetry tương tác học tập, thực thi các mô hình Knowledge Tracing để ước lượng xác suất làm đúng (predictedCorrectness) và tự động tính toán đề xuất bài học tiếp theo phù hợp với năng lực hiện thời của người học.</w:t>
+        <w:br/>
+        <w:t>• Bộ máy thực thi Sandbox (Sandbox Judge - System Actor): Thành phần an ninh vận hành trên Docker container cô lập, chịu trách nhiệm nhận mã nguồn người học, biên dịch và chạy trong môi trường giới hạn tài nguyên (CPU, RAM, timeout) nhằm đối chiếu kết quả với bộ testcase mà không gây rủi ro cho máy chủ chủ trì.</w:t>
+      </w:r>
+    </w:p>
+    <w:p>
+      <w:pPr>
+        <w:spacing w:before="80" w:after="120" w:line="276" w:lineRule="auto"/>
+        <w:jc w:val="both"/>
+      </w:pPr>
+      <w:r>
+        <w:rPr>
+          <w:rFonts w:ascii="Times New Roman" w:hAnsi="Times New Roman"/>
+          <w:rFonts w:ascii="Times New Roman" w:hAnsi="Times New Roman" w:cs="Times New Roman"/>
+          <w:b/>
+          <w:i w:val="0"/>
+          <w:sz w:val="26"/>
+        </w:rPr>
+        <w:t>2. Cấu trúc 3 phân hệ chức năng và 14 ca sử dụng chính (UC01 - UC14):</w:t>
+        <w:br/>
+      </w:r>
+      <w:r>
+        <w:rPr>
+          <w:rFonts w:ascii="Times New Roman" w:hAnsi="Times New Roman"/>
+          <w:rFonts w:ascii="Times New Roman" w:hAnsi="Times New Roman" w:cs="Times New Roman"/>
+          <w:b w:val="0"/>
+          <w:i w:val="0"/>
+          <w:sz w:val="26"/>
+        </w:rPr>
+        <w:t>• Phân hệ Người học &amp; Tương tác học tập: Gồm các ca sử dụng phục vụ trực tiếp quá trình học: Đăng ký &amp; Đăng nhập bảo mật JWT (UC01); Xem danh mục khóa học &amp; Lộ trình thích ứng (UC02); Thực hành viết mã với Monaco Editor (UC03); Trợ giúp thông minh từ AI Assistant (UC04); Nộp bài &amp; Chấm tự động (UC05); và Theo dõi tiến độ cá nhân hóa (UC06).</w:t>
+        <w:br/>
+        <w:t>• Phân hệ Quản trị &amp; Nội dung đào tạo: Phục vụ vận hành và xây dựng học liệu: Quản lý tài khoản &amp; Phân quyền RBAC (UC07); Quản lý khóa học &amp; Nội dung bài học (UC08); Quản lý ngân hàng bài tập &amp; Bộ Testcase kiểm thử (UC09); và Giám sát số liệu &amp; Báo cáo tổng quan hệ thống (UC10).</w:t>
+        <w:br/>
+        <w:t>• Phân hệ Dịch vụ lõi hệ thống &amp; Trí tuệ nhân tạo: Đóng vai trò nền tảng xử lý ngầm: Thực thi an toàn trong Docker Sandbox (UC11); Dự đoán xác suất làm đúng qua Knowledge Tracing (UC12); Đề xuất lộ trình thích ứng theo năng lực (UC13); và Ghi nhận dữ liệu tương tác phục vụ tái huấn luyện mô hình (UC14).</w:t>
+      </w:r>
+    </w:p>
+    <w:p>
+      <w:pPr>
+        <w:spacing w:before="80" w:after="160" w:line="276" w:lineRule="auto"/>
+        <w:jc w:val="both"/>
+      </w:pPr>
+      <w:r>
+        <w:rPr>
+          <w:rFonts w:ascii="Times New Roman" w:hAnsi="Times New Roman"/>
+          <w:rFonts w:ascii="Times New Roman" w:hAnsi="Times New Roman" w:cs="Times New Roman"/>
+          <w:b/>
+          <w:i w:val="0"/>
+          <w:sz w:val="26"/>
+        </w:rPr>
+        <w:t xml:space="preserve">3. Cơ chế liên kết và mối quan hệ «include» cốt lõi: </w:t>
+      </w:r>
+      <w:r>
+        <w:rPr>
+          <w:rFonts w:ascii="Times New Roman" w:hAnsi="Times New Roman"/>
+          <w:rFonts w:ascii="Times New Roman" w:hAnsi="Times New Roman" w:cs="Times New Roman"/>
+          <w:b w:val="0"/>
+          <w:i w:val="0"/>
+          <w:sz w:val="26"/>
+        </w:rPr>
+        <w:t>Trong kiến trúc ca sử dụng, quan hệ «include» phản ánh chặt chẽ quy trình vận hành khép kín và an toàn của hệ thống:</w:t>
+        <w:br/>
+        <w:t>• Khi Học viên thực hiện ca sử dụng «UC05: Nộp bài &amp; Chấm tự động», hệ thống bắt buộc kích hoạt quan hệ «include» đến «UC11: Thực thi an toàn trong Docker Sandbox» và «UC14: Ghi nhận dữ liệu tương tác». Mã nguồn của người học không bao giờ được thực thi trực tiếp trên tiến trình backend mà luôn được đóng gói gửi sang container cô lập để kiểm soát rủi ro an ninh và tài nguyên.</w:t>
+        <w:br/>
+        <w:t>• Ngay sau khi UC11 hoàn tất và trả về kết quả kiểm thử, hệ thống tự động kích hoạt «include» tới «UC12: Dự đoán xác suất qua Knowledge Tracing», cập nhật vector trạng thái tri thức của người học dựa trên kết quả nộp bài mới nhất, từ đó kích hoạt «UC13: Đề xuất lộ trình thích ứng» để gợi ý bài học kế tiếp. Chu trình khép kín này tạo nên năng lực thích ứng cá nhân hóa liên tục xuyên suốt quá trình học tập.</w:t>
+      </w:r>
+    </w:p>
+    <w:p>
+      <w:pPr>
+        <w:spacing w:before="120" w:after="60" w:line="276" w:lineRule="auto"/>
+        <w:jc w:val="both"/>
+      </w:pPr>
+      <w:r/>
+      <w:r>
+        <w:rPr>
+          <w:rFonts w:ascii="Times New Roman" w:hAnsi="Times New Roman"/>
+          <w:rFonts w:ascii="Times New Roman" w:hAnsi="Times New Roman" w:cs="Times New Roman"/>
+          <w:b/>
+          <w:i w:val="0"/>
+          <w:sz w:val="26"/>
+        </w:rPr>
+        <w:t>[ Cung cấp ảnh ] Hình 2.3. Màn hình thực hành lập trình gồm đề bài, Monaco Editor và khu vực kết quả chạy mã.</w:t>
       </w:r>
     </w:p>
     <w:p>
@@ -9351,13 +9618,19 @@
     </w:p>
     <w:p>
       <w:pPr>
-        <w:spacing w:before="80"/>
-      </w:pPr>
-      <w:r>
-        <w:rPr>
+        <w:spacing w:before="120" w:after="60" w:line="276" w:lineRule="auto"/>
+        <w:jc w:val="both"/>
+      </w:pPr>
+      <w:r/>
+      <w:r>
+        <w:rPr>
+          <w:rFonts w:ascii="Times New Roman" w:hAnsi="Times New Roman"/>
+          <w:rFonts w:ascii="Times New Roman" w:hAnsi="Times New Roman" w:cs="Times New Roman"/>
           <w:b/>
-        </w:rPr>
-        <w:t>[ Cung cấp ảnh ] Hình 2.3. Màn hình lộ trình cá nhân hóa hoặc đề xuất bài học tiếp theo.</w:t>
+          <w:i w:val="0"/>
+          <w:sz w:val="26"/>
+        </w:rPr>
+        <w:t>[ Cung cấp ảnh ] Hình 2.4. Màn hình lộ trình cá nhân hóa hoặc đề xuất bài học tiếp theo.</w:t>
       </w:r>
     </w:p>
     <w:p>
@@ -11286,14 +11559,8 @@
             <w:vAlign w:val="center"/>
           </w:tcPr>
           <w:p>
-            <w:pPr>
-              <w:spacing w:after="0" w:line="240" w:lineRule="auto"/>
-            </w:pPr>
-            <w:r>
-              <w:rPr>
-                <w:sz w:val="22"/>
-              </w:rPr>
-              <w:t>Sơ đồ kiến trúc hệ thống LearnPython</w:t>
+            <w:r>
+              <w:t>Sơ đồ kiến trúc &amp; Sơ đồ Use Case tổng thể toàn hệ thống</w:t>
             </w:r>
           </w:p>
         </w:tc>
@@ -11304,14 +11571,8 @@
             <w:vAlign w:val="center"/>
           </w:tcPr>
           <w:p>
-            <w:pPr>
-              <w:spacing w:after="0" w:line="240" w:lineRule="auto"/>
-            </w:pPr>
-            <w:r>
-              <w:rPr>
-                <w:sz w:val="22"/>
-              </w:rPr>
-              <w:t>[ Cung cấp ảnh ]</w:t>
+            <w:r>
+              <w:t>[ Đã cung cấp ]</w:t>
             </w:r>
           </w:p>
         </w:tc>

</xml_diff>